<commit_message>
Harmonize pipeline scripts, notebooks, Figure 4 naming, and Figure 2 legend wording
</commit_message>
<xml_diff>
--- a/manuscript/Figure_Legends.docx
+++ b/manuscript/Figure_Legends.docx
@@ -38,11 +38,7 @@
     </w:p>
     <w:p>
       <w:r>
-        <w:rPr>
-          <w:rFonts w:ascii="Arial" w:hAnsi="Arial"/>
-          <w:sz w:val="19"/>
-        </w:rPr>
-        <w:t>a, Top 15 master transcription factors ranked by physical binding occupancy across 1,475 unique enhancer loci targeted in the MDA-MB-231 CRISPRi screen, quantified from ENCODE ChIP-seq clustered binding peaks. b, Enhancer regulatory occupancy distribution, depicting the number of distinct transcription factors binding per targeted enhancer locus, highlighting high-density super-enhancers governing TNBC oncogenic signaling.</w:t>
+        <w:t>a, Top 15 master transcription factors ranked by physical binding occupancy across targeted super-enhancer loci (from the 1,475-locus screen library) in human TNBC, quantified from ENCODE ChIP-seq clustered binding peaks. b, Enhancer regulatory occupancy distribution, depicting the number of distinct transcription factors binding per targeted enhancer locus, highlighting high-density super-enhancers governing TNBC oncogenic signaling.</w:t>
       </w:r>
     </w:p>
     <w:p/>

</xml_diff>